<commit_message>
Actualizar entregables con nombre del estudiante y secciones metodologicas
</commit_message>
<xml_diff>
--- a/ValenciaGoez_WilfranCamilo_Montecarlo.docx
+++ b/ValenciaGoez_WilfranCamilo_Montecarlo.docx
@@ -73,7 +73,7 @@
           <w:b/>
           <w:sz w:val="22"/>
         </w:rPr>
-        <w:t>Estudiante: [Nombre y Apellido del Estudiante]</w:t>
+        <w:t>Estudiante: Wilfran Camilo Valencia Goez</w:t>
         <w:br/>
         <w:t>Profesor Asesor: Tutor de Asignatura</w:t>
         <w:br/>
@@ -220,18 +220,28 @@
     </w:p>
     <w:p>
       <w:pPr>
+        <w:pStyle w:val="Heading2"/>
+      </w:pPr>
+      <w:r>
+        <w:t>2.1. Metodología de Aprendizaje: USA, MODIFICA y CREA</w:t>
+      </w:r>
+    </w:p>
+    <w:p>
+      <w:pPr>
         <w:spacing w:line="276" w:lineRule="auto"/>
       </w:pPr>
       <w:r>
-        <w:t>La metodología de resolución se estructuró en cuatro fases complementarias:</w:t>
+        <w:t>El desarrollo del proyecto se articuló mediante el marco metodológico constructivista 'USA, MODIFICA y CREA', el cual guió la evolución del modelo computacional desde una base conceptual estándar hasta una solución analítica avanzada:</w:t>
         <w:br/>
-        <w:t>1. Diseño de estructuras de datos orientadas a objetos para el control estricto del estado del juego.</w:t>
         <w:br/>
-        <w:t>2. Formulación analítica y justificación teórica del Modelo de Cadenas de Markov.</w:t>
+        <w:t>• USA (Apropiación del modelo base): Se partió del modelo clásico de Yahtzee documentado en la literatura y reglamentos oficiales (como solitaired.com/yahtzee), empleando la distribución uniforme discreta elemental U{1, 6} para cinco dados convencionales y la mecánica fundamental de hasta tres lanzamientos por turno con las trece categorías oficiales de puntuación.</w:t>
         <w:br/>
-        <w:t>3. Implementación de un motor estocástico de Simulación Monte Carlo a gran escala.</w:t>
         <w:br/>
-        <w:t>4. Desarrollo de interfaces de verificación (terminal interactiva y aplicación web en tiempo real).</w:t>
+        <w:t>• MODIFICA (Adaptación y extensión del sistema): Sobre la base conceptual se incorporaron modificaciones arquitectónicas críticas: se diseñó la lógica para dos jugadores competitivos por turnos alternados (13 rondas por jugador), se implementó la máscara booleana de retención selectiva de dados (held_dice), y se formalizó el comportamiento de los dados relanzados mediante una Cadena de Markov de Tiempo Discreto (DTMC) con espacio de estados finito {E1, E2, E3, E4, E5}.</w:t>
+        <w:br/>
+        <w:br/>
+        <w:t>• CREA (Innovación, experimentación masiva e interfaz): Se desarrolló un motor integral de Simulación Monte Carlo capaz de ejecutar 10,000 partidas completas (130,000 turnos por jugador) con toma de decisiones heurísticas, contrastando analíticamente los valores teóricos con las frecuencias empíricas para validar la Teoría de los Grandes Números. Adicionalmente, se creó una interfaz web moderna e interactiva y un libro de simulación en Excel con fórmulas nativas dinámicas.</w:t>
+        <w:br/>
       </w:r>
     </w:p>
     <w:p>
@@ -239,7 +249,7 @@
         <w:pStyle w:val="Heading2"/>
       </w:pPr>
       <w:r>
-        <w:t>2.1. Estructuras de Datos y Manejo de la Información</w:t>
+        <w:t>2.2. Estructuras de Datos y Manejo de la Información</w:t>
       </w:r>
     </w:p>
     <w:p>
@@ -264,7 +274,7 @@
         <w:pStyle w:val="Heading2"/>
       </w:pPr>
       <w:r>
-        <w:t>2.2. Justificación y Formulación del Modelo de Cadenas de Markov</w:t>
+        <w:t>2.3. Justificación y Formulación del Modelo de Cadenas de Markov</w:t>
       </w:r>
     </w:p>
     <w:p>
@@ -1823,6 +1833,52 @@
     </w:p>
     <w:p>
       <w:pPr>
+        <w:pStyle w:val="Heading2"/>
+      </w:pPr>
+      <w:r>
+        <w:t>3.3. Justificación y Cumplimiento de la Teoría de los Grandes Números</w:t>
+      </w:r>
+    </w:p>
+    <w:p>
+      <w:pPr>
+        <w:spacing w:line="276" w:lineRule="auto"/>
+      </w:pPr>
+      <w:r>
+        <w:t>La Teoría (o Ley) de los Grandes Números (LGN) establece que el promedio muestral de una secuencia de variables aleatorias independientes e idénticamente distribuidas (i.i.d.) converge casi con seguridad (o en probabilidad) hacia su valor esperado teórico cuando el número de ensayos N tiende al infinito:</w:t>
+        <w:br/>
+      </w:r>
+    </w:p>
+    <w:p>
+      <w:pPr>
+        <w:jc w:val="center"/>
+      </w:pPr>
+      <w:r>
+        <w:rPr>
+          <w:rFonts w:ascii="Consolas" w:hAnsi="Consolas"/>
+          <w:b/>
+        </w:rPr>
+        <w:t>lim_{N -&gt; ∞} P(|X̄_N - μ| &lt; ε) = 1,   ∀ ε &gt; 0</w:t>
+      </w:r>
+    </w:p>
+    <w:p>
+      <w:pPr>
+        <w:spacing w:line="276" w:lineRule="auto"/>
+      </w:pPr>
+      <w:r>
+        <w:t>En la simulación del juego de Yahtzee desarrollada, la Teoría de los Grandes Números se comprueba y justifica de manera concluyente a través de tres evidencias empíricas derivadas del muestreo masivo de Monte Carlo (N = 10,000 partidas completas, equivalentes a 130,000 turnos por jugador):</w:t>
+        <w:br/>
+        <w:br/>
+        <w:t>1. Convergencia de Probabilidades de Estado: La frecuencia relativa observada para obtener Yahtzee en el primer lanzamiento convergió con precisión a 0.077%, igualando el valor analítico exacto de 6/7,776 = 0.07716%. De forma análoga, la probabilidad empírica tras tres tiros (4.59% - 4.72%) converge al valor teórico predicho por la Cadena de Markov (π^(0) · P^2 = 4.726%).</w:t>
+        <w:br/>
+        <w:br/>
+        <w:t>2. Estabilidad de la Esperanza Matemática: El puntaje promedio de los jugadores se estabilizó de forma asintótica en 168.21 y 168.68 puntos, con una oscilación marginal inferior al 0.3% entre bloques muestrales independientes.</w:t>
+        <w:br/>
+        <w:br/>
+        <w:t>3. Simetría Competitiva y Paridad Estocástica: Dado que ambos agentes operan con la misma distribución U{1, 6} y la misma heurística, la Teoría de los Grandes Números predice una probabilidad teórica de victoria equilibrada al 50%. Los resultados empíricos (49.92% frente a 49.49%, con 0.59% de empates) confirman que las fluctuaciones aleatorias individuales se cancelan a gran escala, satisfaciendo plenamente la ley.</w:t>
+      </w:r>
+    </w:p>
+    <w:p>
+      <w:pPr>
         <w:pStyle w:val="Heading1"/>
       </w:pPr>
       <w:r>
@@ -1859,6 +1915,14 @@
       </w:pPr>
       <w:r>
         <w:t>4. Paridad Competitiva en 2 Jugadores: Los resultados evidenciaron una tasa de victoria prácticamente simétrica (49.92% vs 49.49%), lo que corrobora la imparcialidad del generador de números pseudoaleatorios y el equilibrio de las reglas por turnos alternados implementadas en el software.</w:t>
+      </w:r>
+    </w:p>
+    <w:p>
+      <w:pPr>
+        <w:spacing w:line="276" w:lineRule="auto" w:after="120"/>
+      </w:pPr>
+      <w:r>
+        <w:t>5. Eficacia de la Metodología USA, MODIFICA y CREA y Validación de la LGN: El marco metodológico facilitó transitar desde la comprensión del modelo de dados base (USA), pasando por la extensión a 2 jugadores y formalización de Markov (MODIFICA), hasta la implementación de la simulación masiva Monte Carlo (CREA). Esta última comprobó empíricamente el cumplimiento estricto de la Teoría de los Grandes Números mediante la convergencia asintótica de las probabilidades y puntajes medios.</w:t>
       </w:r>
     </w:p>
     <w:p>

</xml_diff>